<commit_message>
docs: add office-cli templates and guidelines for numerical methods lab reports
</commit_message>
<xml_diff>
--- a/templates/template_surat_insentif.docx
+++ b/templates/template_surat_insentif.docx
@@ -513,7 +513,7 @@
         <w:lastRenderedPageBreak/>
         <w:drawing>
           <wp:inline distT="0" distB="0" distL="0" distR="0" wp14:anchorId="3B79CEEC" wp14:editId="4B040362">
-            <wp:extent cx="2356123" cy="2194560"/>
+            <wp:extent cx="1645920" cy="2194560"/>
             <wp:effectExtent l="0" t="0" r="6350" b="0"/>
             <wp:docPr id="1789994264" name="Picture 1"/>
             <wp:cNvGraphicFramePr>
@@ -535,7 +535,7 @@
                   <pic:spPr>
                     <a:xfrm>
                       <a:off x="0" y="0"/>
-                      <a:ext cx="2362551" cy="2200547"/>
+                      <a:ext cx="1650410" cy="2200547"/>
                     </a:xfrm>
                     <a:prstGeom prst="rect">
                       <a:avLst/>
@@ -783,26 +783,6 @@
         </w:tc>
       </w:tr>
     </w:tbl>
-    <w:p>
-      <w:pPr>
-        <w:spacing w:before="180"/>
-        <w:ind w:right="352"/>
-        <w:jc w:val="center"/>
-        <w:rPr>
-          <w:b/>
-          <w:sz w:val="24"/>
-          <w:lang w:val="id-ID"/>
-        </w:rPr>
-      </w:pPr>
-      <w:r>
-        <w:rPr>
-          <w:b/>
-          <w:sz w:val="24"/>
-          <w:lang w:val="id-ID"/>
-        </w:rPr>
-        <w:t>Ini gausah dicetak, diganti pengumuman</w:t>
-      </w:r>
-    </w:p>
     <w:p>
       <w:pPr>
         <w:sectPr>

</xml_diff>